<commit_message>
Fix MSANTE master data import and conditional form rendering
</commit_message>
<xml_diff>
--- a/backend/app/templates/template_ancfcc.docx
+++ b/backend/app/templates/template_ancfcc.docx
@@ -421,8 +421,47 @@
             <w:vAlign w:val="center"/>
           </w:tcPr>
           <w:p>
-            <w:r>
-              <w:t>{{ date_intervention }}</w:t>
+            <w:pPr>
+              <w:jc w:val="center"/>
+              <w:rPr>
+                <w:rFonts w:ascii="Arial" w:hAnsi="Arial" w:cs="Arial"/>
+                <w:b/>
+              </w:rPr>
+            </w:pPr>
+            <w:r>
+              <w:rPr>
+                <w:rFonts w:ascii="Arial" w:hAnsi="Arial" w:cs="Arial"/>
+                <w:b/>
+              </w:rPr>
+              <w:t>..….</w:t>
+            </w:r>
+            <w:r>
+              <w:rPr>
+                <w:rFonts w:ascii="Arial" w:hAnsi="Arial" w:cs="Arial"/>
+                <w:b/>
+              </w:rPr>
+              <w:t xml:space="preserve"> </w:t>
+            </w:r>
+            <w:r>
+              <w:rPr>
+                <w:rFonts w:ascii="Arial" w:hAnsi="Arial" w:cs="Arial"/>
+                <w:b/>
+              </w:rPr>
+              <w:t>/…..</w:t>
+            </w:r>
+            <w:r>
+              <w:rPr>
+                <w:rFonts w:ascii="Arial" w:hAnsi="Arial" w:cs="Arial"/>
+                <w:b/>
+              </w:rPr>
+              <w:t xml:space="preserve"> </w:t>
+            </w:r>
+            <w:r>
+              <w:rPr>
+                <w:rFonts w:ascii="Arial" w:hAnsi="Arial" w:cs="Arial"/>
+                <w:b/>
+              </w:rPr>
+              <w:t>/……….</w:t>
             </w:r>
           </w:p>
         </w:tc>
@@ -546,9 +585,26 @@
             <w:vAlign w:val="center"/>
           </w:tcPr>
           <w:p>
-            <w:r>
-              <w:t>{{ nom_technicien }}</w:t>
-            </w:r>
+            <w:pPr>
+              <w:tabs>
+                <w:tab w:val="left" w:pos="3780"/>
+              </w:tabs>
+              <w:rPr>
+                <w:rFonts w:cstheme="minorHAnsi"/>
+                <w:b/>
+              </w:rPr>
+            </w:pPr>
+          </w:p>
+          <w:p>
+            <w:pPr>
+              <w:tabs>
+                <w:tab w:val="left" w:pos="3780"/>
+              </w:tabs>
+              <w:rPr>
+                <w:rFonts w:cstheme="minorHAnsi"/>
+                <w:b/>
+              </w:rPr>
+            </w:pPr>
           </w:p>
         </w:tc>
         <w:tc>
@@ -557,9 +613,24 @@
             <w:vAlign w:val="center"/>
           </w:tcPr>
           <w:p>
-            <w:r>
-              <w:t>{{ nom_responsable }}</w:t>
-            </w:r>
+            <w:pPr>
+              <w:tabs>
+                <w:tab w:val="left" w:pos="3780"/>
+              </w:tabs>
+              <w:rPr>
+                <w:rFonts w:cstheme="minorHAnsi"/>
+              </w:rPr>
+            </w:pPr>
+          </w:p>
+          <w:p>
+            <w:pPr>
+              <w:tabs>
+                <w:tab w:val="left" w:pos="3780"/>
+              </w:tabs>
+              <w:rPr>
+                <w:rFonts w:cstheme="minorHAnsi"/>
+              </w:rPr>
+            </w:pPr>
           </w:p>
         </w:tc>
       </w:tr>
@@ -748,8 +819,20 @@
             <w:vAlign w:val="center"/>
           </w:tcPr>
           <w:p>
-            <w:r>
-              <w:t>{{ puissance_kva }}</w:t>
+            <w:pPr>
+              <w:jc w:val="center"/>
+            </w:pPr>
+            <w:r>
+              <w:rPr>
+                <w:rFonts w:cstheme="minorHAnsi"/>
+              </w:rPr>
+              <w:t xml:space="preserve">…….. </w:t>
+            </w:r>
+            <w:r>
+              <w:rPr>
+                <w:rFonts w:cstheme="minorHAnsi"/>
+              </w:rPr>
+              <w:t>KVA</w:t>
             </w:r>
           </w:p>
         </w:tc>
@@ -788,21 +871,33 @@
             <w:vAlign w:val="center"/>
           </w:tcPr>
           <w:p>
-            <w:r>
-              <w:t>{{ zone }}</w:t>
-            </w:r>
-          </w:p>
-        </w:tc>
-        <w:tc>
-          <w:tcPr>
-            <w:tcW w:w="2968" w:type="dxa"/>
-            <w:vAlign w:val="center"/>
-          </w:tcPr>
-          <w:p>
             <w:pPr>
               <w:tabs>
                 <w:tab w:val="left" w:pos="3780"/>
               </w:tabs>
+              <w:jc w:val="center"/>
+              <w:rPr>
+                <w:rFonts w:cstheme="minorHAnsi"/>
+              </w:rPr>
+            </w:pPr>
+            <w:r>
+              <w:rPr>
+                <w:rFonts w:cstheme="minorHAnsi"/>
+              </w:rPr>
+              <w:t>SUD</w:t>
+            </w:r>
+          </w:p>
+        </w:tc>
+        <w:tc>
+          <w:tcPr>
+            <w:tcW w:w="2968" w:type="dxa"/>
+            <w:vAlign w:val="center"/>
+          </w:tcPr>
+          <w:p>
+            <w:pPr>
+              <w:tabs>
+                <w:tab w:val="left" w:pos="3780"/>
+              </w:tabs>
               <w:rPr>
                 <w:rFonts w:cstheme="minorHAnsi"/>
                 <w:b/>
@@ -823,9 +918,15 @@
             <w:vAlign w:val="center"/>
           </w:tcPr>
           <w:p>
-            <w:r>
-              <w:t>{{ nb_batteries }}</w:t>
-            </w:r>
+            <w:pPr>
+              <w:tabs>
+                <w:tab w:val="left" w:pos="3780"/>
+              </w:tabs>
+              <w:jc w:val="center"/>
+              <w:rPr>
+                <w:rFonts w:cstheme="minorHAnsi"/>
+              </w:rPr>
+            </w:pPr>
           </w:p>
         </w:tc>
       </w:tr>
@@ -863,21 +964,33 @@
             <w:vAlign w:val="center"/>
           </w:tcPr>
           <w:p>
-            <w:r>
-              <w:t>{{ ville }}</w:t>
-            </w:r>
-          </w:p>
-        </w:tc>
-        <w:tc>
-          <w:tcPr>
-            <w:tcW w:w="2968" w:type="dxa"/>
-            <w:vAlign w:val="center"/>
-          </w:tcPr>
-          <w:p>
             <w:pPr>
               <w:tabs>
                 <w:tab w:val="left" w:pos="3780"/>
               </w:tabs>
+              <w:jc w:val="center"/>
+              <w:rPr>
+                <w:rFonts w:cstheme="minorHAnsi"/>
+              </w:rPr>
+            </w:pPr>
+            <w:r>
+              <w:rPr>
+                <w:rFonts w:cstheme="minorHAnsi"/>
+              </w:rPr>
+              <w:t>AGADIR</w:t>
+            </w:r>
+          </w:p>
+        </w:tc>
+        <w:tc>
+          <w:tcPr>
+            <w:tcW w:w="2968" w:type="dxa"/>
+            <w:vAlign w:val="center"/>
+          </w:tcPr>
+          <w:p>
+            <w:pPr>
+              <w:tabs>
+                <w:tab w:val="left" w:pos="3780"/>
+              </w:tabs>
               <w:rPr>
                 <w:rFonts w:cstheme="minorHAnsi"/>
                 <w:b/>
@@ -905,8 +1018,32 @@
             <w:vAlign w:val="center"/>
           </w:tcPr>
           <w:p>
-            <w:r>
-              <w:t>{{ marque_modele }}</w:t>
+            <w:pPr>
+              <w:tabs>
+                <w:tab w:val="left" w:pos="3780"/>
+              </w:tabs>
+              <w:jc w:val="center"/>
+              <w:rPr>
+                <w:rFonts w:cstheme="minorHAnsi"/>
+              </w:rPr>
+            </w:pPr>
+            <w:r>
+              <w:rPr>
+                <w:rFonts w:cstheme="minorHAnsi"/>
+              </w:rPr>
+              <w:t>Riello</w:t>
+            </w:r>
+            <w:r>
+              <w:rPr>
+                <w:rFonts w:cstheme="minorHAnsi"/>
+              </w:rPr>
+              <w:t xml:space="preserve"> 15</w:t>
+            </w:r>
+            <w:r>
+              <w:rPr>
+                <w:rFonts w:cstheme="minorHAnsi"/>
+              </w:rPr>
+              <w:t xml:space="preserve"> KVA</w:t>
             </w:r>
           </w:p>
         </w:tc>
@@ -947,21 +1084,33 @@
             <w:vAlign w:val="center"/>
           </w:tcPr>
           <w:p>
-            <w:r>
-              <w:t>{{ etablissement }}</w:t>
-            </w:r>
-          </w:p>
-        </w:tc>
-        <w:tc>
-          <w:tcPr>
-            <w:tcW w:w="2968" w:type="dxa"/>
-            <w:vAlign w:val="center"/>
-          </w:tcPr>
-          <w:p>
             <w:pPr>
               <w:tabs>
                 <w:tab w:val="left" w:pos="3780"/>
               </w:tabs>
+              <w:jc w:val="center"/>
+              <w:rPr>
+                <w:rFonts w:cstheme="minorHAnsi"/>
+              </w:rPr>
+            </w:pPr>
+            <w:r>
+              <w:rPr>
+                <w:rFonts w:cstheme="minorHAnsi"/>
+              </w:rPr>
+              <w:t>CADASTRE</w:t>
+            </w:r>
+          </w:p>
+        </w:tc>
+        <w:tc>
+          <w:tcPr>
+            <w:tcW w:w="2968" w:type="dxa"/>
+            <w:vAlign w:val="center"/>
+          </w:tcPr>
+          <w:p>
+            <w:pPr>
+              <w:tabs>
+                <w:tab w:val="left" w:pos="3780"/>
+              </w:tabs>
               <w:rPr>
                 <w:rFonts w:cstheme="minorHAnsi"/>
                 <w:b/>
@@ -982,9 +1131,15 @@
             <w:vAlign w:val="center"/>
           </w:tcPr>
           <w:p>
-            <w:r>
-              <w:t>{{ nom_site }}</w:t>
-            </w:r>
+            <w:pPr>
+              <w:tabs>
+                <w:tab w:val="left" w:pos="3780"/>
+              </w:tabs>
+              <w:jc w:val="center"/>
+              <w:rPr>
+                <w:rFonts w:cstheme="minorHAnsi"/>
+              </w:rPr>
+            </w:pPr>
           </w:p>
         </w:tc>
       </w:tr>
@@ -1072,8 +1227,20 @@
             <w:vAlign w:val="center"/>
           </w:tcPr>
           <w:p>
-            <w:r>
-              <w:t>{{ numero_serie }}</w:t>
+            <w:pPr>
+              <w:tabs>
+                <w:tab w:val="left" w:pos="3780"/>
+              </w:tabs>
+              <w:jc w:val="center"/>
+              <w:rPr>
+                <w:rFonts w:cstheme="minorHAnsi"/>
+              </w:rPr>
+            </w:pPr>
+            <w:r>
+              <w:rPr>
+                <w:rFonts w:cstheme="minorHAnsi"/>
+              </w:rPr>
+              <w:t>LU53UT895900002</w:t>
             </w:r>
           </w:p>
         </w:tc>
@@ -1155,8 +1322,19 @@
             <w:vAlign w:val="center"/>
           </w:tcPr>
           <w:p>
-            <w:r>
-              <w:t>{{ capacite_batteries }}</w:t>
+            <w:pPr>
+              <w:tabs>
+                <w:tab w:val="left" w:pos="3780"/>
+              </w:tabs>
+              <w:rPr>
+                <w:rFonts w:cstheme="minorHAnsi"/>
+              </w:rPr>
+            </w:pPr>
+            <w:r>
+              <w:rPr>
+                <w:rFonts w:cstheme="minorHAnsi"/>
+              </w:rPr>
+              <w:t xml:space="preserve"> </w:t>
             </w:r>
           </w:p>
         </w:tc>
@@ -1415,8 +1593,106 @@
             <w:hideMark/>
           </w:tcPr>
           <w:p>
-            <w:r>
-              <w:t>{{ pt1_oui }}</w:t>
+            <w:pPr>
+              <w:tabs>
+                <w:tab w:val="left" w:pos="3780"/>
+              </w:tabs>
+              <w:jc w:val="center"/>
+              <w:rPr>
+                <w:rFonts w:cstheme="minorHAnsi"/>
+              </w:rPr>
+            </w:pPr>
+            <w:r>
+              <w:rPr>
+                <w:noProof/>
+              </w:rPr>
+              <mc:AlternateContent>
+                <mc:Choice Requires="wps">
+                  <w:drawing>
+                    <wp:anchor distT="0" distB="0" distL="114300" distR="114300" simplePos="0" relativeHeight="251651072" behindDoc="0" locked="0" layoutInCell="1" allowOverlap="1">
+                      <wp:simplePos x="0" y="0"/>
+                      <wp:positionH relativeFrom="column">
+                        <wp:posOffset>97790</wp:posOffset>
+                      </wp:positionH>
+                      <wp:positionV relativeFrom="paragraph">
+                        <wp:posOffset>22860</wp:posOffset>
+                      </wp:positionV>
+                      <wp:extent cx="127635" cy="116840"/>
+                      <wp:effectExtent l="0" t="0" r="24765" b="16510"/>
+                      <wp:wrapNone/>
+                      <wp:docPr id="7" name="AutoShape 647"/>
+                      <wp:cNvGraphicFramePr>
+                        <a:graphicFrameLocks xmlns:a="http://schemas.openxmlformats.org/drawingml/2006/main"/>
+                      </wp:cNvGraphicFramePr>
+                      <a:graphic xmlns:a="http://schemas.openxmlformats.org/drawingml/2006/main">
+                        <a:graphicData uri="http://schemas.microsoft.com/office/word/2010/wordprocessingShape">
+                          <wps:wsp>
+                            <wps:cNvSpPr>
+                              <a:spLocks noChangeArrowheads="1"/>
+                            </wps:cNvSpPr>
+                            <wps:spPr bwMode="auto">
+                              <a:xfrm>
+                                <a:off x="0" y="0"/>
+                                <a:ext cx="127635" cy="116840"/>
+                              </a:xfrm>
+                              <a:prstGeom prst="roundRect">
+                                <a:avLst>
+                                  <a:gd name="adj" fmla="val 16667"/>
+                                </a:avLst>
+                              </a:prstGeom>
+                              <a:solidFill>
+                                <a:schemeClr val="lt1">
+                                  <a:lumMod val="100000"/>
+                                  <a:lumOff val="0"/>
+                                </a:schemeClr>
+                              </a:solidFill>
+                              <a:ln w="12700">
+                                <a:solidFill>
+                                  <a:schemeClr val="dk1">
+                                    <a:lumMod val="100000"/>
+                                    <a:lumOff val="0"/>
+                                  </a:schemeClr>
+                                </a:solidFill>
+                                <a:round/>
+                                <a:headEnd/>
+                                <a:tailEnd/>
+                              </a:ln>
+                              <a:effectLst/>
+                              <a:extLst>
+                                <a:ext uri="{AF507438-7753-43E0-B8FC-AC1667EBCBE1}">
+                                  <a14:hiddenEffects xmlns:a14="http://schemas.microsoft.com/office/drawing/2010/main">
+                                    <a:effectLst>
+                                      <a:outerShdw dist="35921" dir="2700000" algn="ctr" rotWithShape="0">
+                                        <a:srgbClr val="868686"/>
+                                      </a:outerShdw>
+                                    </a:effectLst>
+                                  </a14:hiddenEffects>
+                                </a:ext>
+                              </a:extLst>
+                            </wps:spPr>
+                            <wps:bodyPr rot="0" vert="horz" wrap="square" lIns="91440" tIns="45720" rIns="91440" bIns="45720" anchor="t" anchorCtr="0" upright="1">
+                              <a:noAutofit/>
+                            </wps:bodyPr>
+                          </wps:wsp>
+                        </a:graphicData>
+                      </a:graphic>
+                      <wp14:sizeRelH relativeFrom="page">
+                        <wp14:pctWidth>0</wp14:pctWidth>
+                      </wp14:sizeRelH>
+                      <wp14:sizeRelV relativeFrom="page">
+                        <wp14:pctHeight>0</wp14:pctHeight>
+                      </wp14:sizeRelV>
+                    </wp:anchor>
+                  </w:drawing>
+                </mc:Choice>
+                <mc:Fallback>
+                  <w:pict>
+                    <v:roundrect w14:anchorId="73F59C78" id="AutoShape 647" o:spid="_x0000_s1026" style="position:absolute;margin-left:7.7pt;margin-top:1.8pt;width:10.05pt;height:9.2pt;z-index:251651072;visibility:visible;mso-wrap-style:square;mso-width-percent:0;mso-height-percent:0;mso-wrap-distance-left:9pt;mso-wrap-distance-top:0;mso-wrap-distance-right:9pt;mso-wrap-distance-bottom:0;mso-position-horizontal:absolute;mso-position-horizontal-relative:text;mso-position-vertical:absolute;mso-position-vertical-relative:text;mso-width-percent:0;mso-height-percent:0;mso-width-relative:page;mso-height-relative:page;v-text-anchor:top" arcsize="10923f" o:gfxdata="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" fillcolor="white [3201]" strokecolor="black [3200]" strokeweight="1pt">
+                      <v:shadow color="#868686"/>
+                    </v:roundrect>
+                  </w:pict>
+                </mc:Fallback>
+              </mc:AlternateContent>
             </w:r>
           </w:p>
         </w:tc>
@@ -1432,9 +1708,11 @@
             <w:vAlign w:val="center"/>
           </w:tcPr>
           <w:p>
-            <w:r>
-              <w:t>{{ pt1_obs }}</w:t>
-            </w:r>
+            <w:pPr>
+              <w:rPr>
+                <w:rFonts w:cstheme="minorHAnsi"/>
+              </w:rPr>
+            </w:pPr>
           </w:p>
         </w:tc>
       </w:tr>
@@ -1501,8 +1779,106 @@
             <w:hideMark/>
           </w:tcPr>
           <w:p>
-            <w:r>
-              <w:t>{{ pt2_oui }}</w:t>
+            <w:pPr>
+              <w:tabs>
+                <w:tab w:val="left" w:pos="3780"/>
+              </w:tabs>
+              <w:jc w:val="center"/>
+              <w:rPr>
+                <w:rFonts w:cstheme="minorHAnsi"/>
+              </w:rPr>
+            </w:pPr>
+            <w:r>
+              <w:rPr>
+                <w:noProof/>
+              </w:rPr>
+              <mc:AlternateContent>
+                <mc:Choice Requires="wps">
+                  <w:drawing>
+                    <wp:anchor distT="0" distB="0" distL="114300" distR="114300" simplePos="0" relativeHeight="251652096" behindDoc="0" locked="0" layoutInCell="1" allowOverlap="1">
+                      <wp:simplePos x="0" y="0"/>
+                      <wp:positionH relativeFrom="column">
+                        <wp:posOffset>97790</wp:posOffset>
+                      </wp:positionH>
+                      <wp:positionV relativeFrom="paragraph">
+                        <wp:posOffset>22860</wp:posOffset>
+                      </wp:positionV>
+                      <wp:extent cx="127635" cy="116840"/>
+                      <wp:effectExtent l="0" t="0" r="24765" b="16510"/>
+                      <wp:wrapNone/>
+                      <wp:docPr id="6" name="AutoShape 647"/>
+                      <wp:cNvGraphicFramePr>
+                        <a:graphicFrameLocks xmlns:a="http://schemas.openxmlformats.org/drawingml/2006/main"/>
+                      </wp:cNvGraphicFramePr>
+                      <a:graphic xmlns:a="http://schemas.openxmlformats.org/drawingml/2006/main">
+                        <a:graphicData uri="http://schemas.microsoft.com/office/word/2010/wordprocessingShape">
+                          <wps:wsp>
+                            <wps:cNvSpPr>
+                              <a:spLocks noChangeArrowheads="1"/>
+                            </wps:cNvSpPr>
+                            <wps:spPr bwMode="auto">
+                              <a:xfrm>
+                                <a:off x="0" y="0"/>
+                                <a:ext cx="127635" cy="116840"/>
+                              </a:xfrm>
+                              <a:prstGeom prst="roundRect">
+                                <a:avLst>
+                                  <a:gd name="adj" fmla="val 16667"/>
+                                </a:avLst>
+                              </a:prstGeom>
+                              <a:solidFill>
+                                <a:schemeClr val="lt1">
+                                  <a:lumMod val="100000"/>
+                                  <a:lumOff val="0"/>
+                                </a:schemeClr>
+                              </a:solidFill>
+                              <a:ln w="12700">
+                                <a:solidFill>
+                                  <a:schemeClr val="dk1">
+                                    <a:lumMod val="100000"/>
+                                    <a:lumOff val="0"/>
+                                  </a:schemeClr>
+                                </a:solidFill>
+                                <a:round/>
+                                <a:headEnd/>
+                                <a:tailEnd/>
+                              </a:ln>
+                              <a:effectLst/>
+                              <a:extLst>
+                                <a:ext uri="{AF507438-7753-43E0-B8FC-AC1667EBCBE1}">
+                                  <a14:hiddenEffects xmlns:a14="http://schemas.microsoft.com/office/drawing/2010/main">
+                                    <a:effectLst>
+                                      <a:outerShdw dist="35921" dir="2700000" algn="ctr" rotWithShape="0">
+                                        <a:srgbClr val="868686"/>
+                                      </a:outerShdw>
+                                    </a:effectLst>
+                                  </a14:hiddenEffects>
+                                </a:ext>
+                              </a:extLst>
+                            </wps:spPr>
+                            <wps:bodyPr rot="0" vert="horz" wrap="square" lIns="91440" tIns="45720" rIns="91440" bIns="45720" anchor="t" anchorCtr="0" upright="1">
+                              <a:noAutofit/>
+                            </wps:bodyPr>
+                          </wps:wsp>
+                        </a:graphicData>
+                      </a:graphic>
+                      <wp14:sizeRelH relativeFrom="page">
+                        <wp14:pctWidth>0</wp14:pctWidth>
+                      </wp14:sizeRelH>
+                      <wp14:sizeRelV relativeFrom="page">
+                        <wp14:pctHeight>0</wp14:pctHeight>
+                      </wp14:sizeRelV>
+                    </wp:anchor>
+                  </w:drawing>
+                </mc:Choice>
+                <mc:Fallback>
+                  <w:pict>
+                    <v:roundrect w14:anchorId="327EC62B" id="AutoShape 647" o:spid="_x0000_s1026" style="position:absolute;margin-left:7.7pt;margin-top:1.8pt;width:10.05pt;height:9.2pt;z-index:251652096;visibility:visible;mso-wrap-style:square;mso-width-percent:0;mso-height-percent:0;mso-wrap-distance-left:9pt;mso-wrap-distance-top:0;mso-wrap-distance-right:9pt;mso-wrap-distance-bottom:0;mso-position-horizontal:absolute;mso-position-horizontal-relative:text;mso-position-vertical:absolute;mso-position-vertical-relative:text;mso-width-percent:0;mso-height-percent:0;mso-width-relative:page;mso-height-relative:page;v-text-anchor:top" arcsize="10923f" o:gfxdata="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" fillcolor="white [3201]" strokecolor="black [3200]" strokeweight="1pt">
+                      <v:shadow color="#868686"/>
+                    </v:roundrect>
+                  </w:pict>
+                </mc:Fallback>
+              </mc:AlternateContent>
             </w:r>
           </w:p>
         </w:tc>
@@ -1518,9 +1894,11 @@
             <w:vAlign w:val="center"/>
           </w:tcPr>
           <w:p>
-            <w:r>
-              <w:t>{{ pt2_obs }}</w:t>
-            </w:r>
+            <w:pPr>
+              <w:rPr>
+                <w:rFonts w:cstheme="minorHAnsi"/>
+              </w:rPr>
+            </w:pPr>
           </w:p>
         </w:tc>
       </w:tr>
@@ -1587,8 +1965,106 @@
             <w:hideMark/>
           </w:tcPr>
           <w:p>
-            <w:r>
-              <w:t>{{ pt3_oui }}</w:t>
+            <w:pPr>
+              <w:tabs>
+                <w:tab w:val="left" w:pos="3780"/>
+              </w:tabs>
+              <w:jc w:val="center"/>
+              <w:rPr>
+                <w:rFonts w:cstheme="minorHAnsi"/>
+              </w:rPr>
+            </w:pPr>
+            <w:r>
+              <w:rPr>
+                <w:noProof/>
+              </w:rPr>
+              <mc:AlternateContent>
+                <mc:Choice Requires="wps">
+                  <w:drawing>
+                    <wp:anchor distT="0" distB="0" distL="114300" distR="114300" simplePos="0" relativeHeight="251653120" behindDoc="0" locked="0" layoutInCell="1" allowOverlap="1">
+                      <wp:simplePos x="0" y="0"/>
+                      <wp:positionH relativeFrom="column">
+                        <wp:posOffset>97790</wp:posOffset>
+                      </wp:positionH>
+                      <wp:positionV relativeFrom="paragraph">
+                        <wp:posOffset>22860</wp:posOffset>
+                      </wp:positionV>
+                      <wp:extent cx="127635" cy="116840"/>
+                      <wp:effectExtent l="0" t="0" r="24765" b="16510"/>
+                      <wp:wrapNone/>
+                      <wp:docPr id="5" name="AutoShape 647"/>
+                      <wp:cNvGraphicFramePr>
+                        <a:graphicFrameLocks xmlns:a="http://schemas.openxmlformats.org/drawingml/2006/main"/>
+                      </wp:cNvGraphicFramePr>
+                      <a:graphic xmlns:a="http://schemas.openxmlformats.org/drawingml/2006/main">
+                        <a:graphicData uri="http://schemas.microsoft.com/office/word/2010/wordprocessingShape">
+                          <wps:wsp>
+                            <wps:cNvSpPr>
+                              <a:spLocks noChangeArrowheads="1"/>
+                            </wps:cNvSpPr>
+                            <wps:spPr bwMode="auto">
+                              <a:xfrm>
+                                <a:off x="0" y="0"/>
+                                <a:ext cx="127635" cy="116840"/>
+                              </a:xfrm>
+                              <a:prstGeom prst="roundRect">
+                                <a:avLst>
+                                  <a:gd name="adj" fmla="val 16667"/>
+                                </a:avLst>
+                              </a:prstGeom>
+                              <a:solidFill>
+                                <a:schemeClr val="lt1">
+                                  <a:lumMod val="100000"/>
+                                  <a:lumOff val="0"/>
+                                </a:schemeClr>
+                              </a:solidFill>
+                              <a:ln w="12700">
+                                <a:solidFill>
+                                  <a:schemeClr val="dk1">
+                                    <a:lumMod val="100000"/>
+                                    <a:lumOff val="0"/>
+                                  </a:schemeClr>
+                                </a:solidFill>
+                                <a:round/>
+                                <a:headEnd/>
+                                <a:tailEnd/>
+                              </a:ln>
+                              <a:effectLst/>
+                              <a:extLst>
+                                <a:ext uri="{AF507438-7753-43E0-B8FC-AC1667EBCBE1}">
+                                  <a14:hiddenEffects xmlns:a14="http://schemas.microsoft.com/office/drawing/2010/main">
+                                    <a:effectLst>
+                                      <a:outerShdw dist="35921" dir="2700000" algn="ctr" rotWithShape="0">
+                                        <a:srgbClr val="868686"/>
+                                      </a:outerShdw>
+                                    </a:effectLst>
+                                  </a14:hiddenEffects>
+                                </a:ext>
+                              </a:extLst>
+                            </wps:spPr>
+                            <wps:bodyPr rot="0" vert="horz" wrap="square" lIns="91440" tIns="45720" rIns="91440" bIns="45720" anchor="t" anchorCtr="0" upright="1">
+                              <a:noAutofit/>
+                            </wps:bodyPr>
+                          </wps:wsp>
+                        </a:graphicData>
+                      </a:graphic>
+                      <wp14:sizeRelH relativeFrom="page">
+                        <wp14:pctWidth>0</wp14:pctWidth>
+                      </wp14:sizeRelH>
+                      <wp14:sizeRelV relativeFrom="page">
+                        <wp14:pctHeight>0</wp14:pctHeight>
+                      </wp14:sizeRelV>
+                    </wp:anchor>
+                  </w:drawing>
+                </mc:Choice>
+                <mc:Fallback>
+                  <w:pict>
+                    <v:roundrect w14:anchorId="7F6DCA8E" id="AutoShape 647" o:spid="_x0000_s1026" style="position:absolute;margin-left:7.7pt;margin-top:1.8pt;width:10.05pt;height:9.2pt;z-index:251653120;visibility:visible;mso-wrap-style:square;mso-width-percent:0;mso-height-percent:0;mso-wrap-distance-left:9pt;mso-wrap-distance-top:0;mso-wrap-distance-right:9pt;mso-wrap-distance-bottom:0;mso-position-horizontal:absolute;mso-position-horizontal-relative:text;mso-position-vertical:absolute;mso-position-vertical-relative:text;mso-width-percent:0;mso-height-percent:0;mso-width-relative:page;mso-height-relative:page;v-text-anchor:top" arcsize="10923f" o:gfxdata="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" fillcolor="white [3201]" strokecolor="black [3200]" strokeweight="1pt">
+                      <v:shadow color="#868686"/>
+                    </v:roundrect>
+                  </w:pict>
+                </mc:Fallback>
+              </mc:AlternateContent>
             </w:r>
           </w:p>
         </w:tc>
@@ -1604,9 +2080,11 @@
             <w:vAlign w:val="center"/>
           </w:tcPr>
           <w:p>
-            <w:r>
-              <w:t>{{ pt3_obs }}</w:t>
-            </w:r>
+            <w:pPr>
+              <w:rPr>
+                <w:rFonts w:cstheme="minorHAnsi"/>
+              </w:rPr>
+            </w:pPr>
           </w:p>
         </w:tc>
       </w:tr>
@@ -1670,8 +2148,106 @@
             <w:hideMark/>
           </w:tcPr>
           <w:p>
-            <w:r>
-              <w:t>{{ pt4_oui }}</w:t>
+            <w:pPr>
+              <w:tabs>
+                <w:tab w:val="left" w:pos="3780"/>
+              </w:tabs>
+              <w:jc w:val="center"/>
+              <w:rPr>
+                <w:rFonts w:cstheme="minorHAnsi"/>
+              </w:rPr>
+            </w:pPr>
+            <w:r>
+              <w:rPr>
+                <w:noProof/>
+              </w:rPr>
+              <mc:AlternateContent>
+                <mc:Choice Requires="wps">
+                  <w:drawing>
+                    <wp:anchor distT="0" distB="0" distL="114300" distR="114300" simplePos="0" relativeHeight="251654144" behindDoc="0" locked="0" layoutInCell="1" allowOverlap="1">
+                      <wp:simplePos x="0" y="0"/>
+                      <wp:positionH relativeFrom="column">
+                        <wp:posOffset>97790</wp:posOffset>
+                      </wp:positionH>
+                      <wp:positionV relativeFrom="paragraph">
+                        <wp:posOffset>22860</wp:posOffset>
+                      </wp:positionV>
+                      <wp:extent cx="127635" cy="116840"/>
+                      <wp:effectExtent l="0" t="0" r="24765" b="16510"/>
+                      <wp:wrapNone/>
+                      <wp:docPr id="4" name="AutoShape 647"/>
+                      <wp:cNvGraphicFramePr>
+                        <a:graphicFrameLocks xmlns:a="http://schemas.openxmlformats.org/drawingml/2006/main"/>
+                      </wp:cNvGraphicFramePr>
+                      <a:graphic xmlns:a="http://schemas.openxmlformats.org/drawingml/2006/main">
+                        <a:graphicData uri="http://schemas.microsoft.com/office/word/2010/wordprocessingShape">
+                          <wps:wsp>
+                            <wps:cNvSpPr>
+                              <a:spLocks noChangeArrowheads="1"/>
+                            </wps:cNvSpPr>
+                            <wps:spPr bwMode="auto">
+                              <a:xfrm>
+                                <a:off x="0" y="0"/>
+                                <a:ext cx="127635" cy="116840"/>
+                              </a:xfrm>
+                              <a:prstGeom prst="roundRect">
+                                <a:avLst>
+                                  <a:gd name="adj" fmla="val 16667"/>
+                                </a:avLst>
+                              </a:prstGeom>
+                              <a:solidFill>
+                                <a:schemeClr val="lt1">
+                                  <a:lumMod val="100000"/>
+                                  <a:lumOff val="0"/>
+                                </a:schemeClr>
+                              </a:solidFill>
+                              <a:ln w="12700">
+                                <a:solidFill>
+                                  <a:schemeClr val="dk1">
+                                    <a:lumMod val="100000"/>
+                                    <a:lumOff val="0"/>
+                                  </a:schemeClr>
+                                </a:solidFill>
+                                <a:round/>
+                                <a:headEnd/>
+                                <a:tailEnd/>
+                              </a:ln>
+                              <a:effectLst/>
+                              <a:extLst>
+                                <a:ext uri="{AF507438-7753-43E0-B8FC-AC1667EBCBE1}">
+                                  <a14:hiddenEffects xmlns:a14="http://schemas.microsoft.com/office/drawing/2010/main">
+                                    <a:effectLst>
+                                      <a:outerShdw dist="35921" dir="2700000" algn="ctr" rotWithShape="0">
+                                        <a:srgbClr val="868686"/>
+                                      </a:outerShdw>
+                                    </a:effectLst>
+                                  </a14:hiddenEffects>
+                                </a:ext>
+                              </a:extLst>
+                            </wps:spPr>
+                            <wps:bodyPr rot="0" vert="horz" wrap="square" lIns="91440" tIns="45720" rIns="91440" bIns="45720" anchor="t" anchorCtr="0" upright="1">
+                              <a:noAutofit/>
+                            </wps:bodyPr>
+                          </wps:wsp>
+                        </a:graphicData>
+                      </a:graphic>
+                      <wp14:sizeRelH relativeFrom="page">
+                        <wp14:pctWidth>0</wp14:pctWidth>
+                      </wp14:sizeRelH>
+                      <wp14:sizeRelV relativeFrom="page">
+                        <wp14:pctHeight>0</wp14:pctHeight>
+                      </wp14:sizeRelV>
+                    </wp:anchor>
+                  </w:drawing>
+                </mc:Choice>
+                <mc:Fallback>
+                  <w:pict>
+                    <v:roundrect w14:anchorId="5850D9CD" id="AutoShape 647" o:spid="_x0000_s1026" style="position:absolute;margin-left:7.7pt;margin-top:1.8pt;width:10.05pt;height:9.2pt;z-index:251654144;visibility:visible;mso-wrap-style:square;mso-width-percent:0;mso-height-percent:0;mso-wrap-distance-left:9pt;mso-wrap-distance-top:0;mso-wrap-distance-right:9pt;mso-wrap-distance-bottom:0;mso-position-horizontal:absolute;mso-position-horizontal-relative:text;mso-position-vertical:absolute;mso-position-vertical-relative:text;mso-width-percent:0;mso-height-percent:0;mso-width-relative:page;mso-height-relative:page;v-text-anchor:top" arcsize="10923f" o:gfxdata="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" fillcolor="white [3201]" strokecolor="black [3200]" strokeweight="1pt">
+                      <v:shadow color="#868686"/>
+                    </v:roundrect>
+                  </w:pict>
+                </mc:Fallback>
+              </mc:AlternateContent>
             </w:r>
           </w:p>
         </w:tc>
@@ -1687,9 +2263,11 @@
             <w:vAlign w:val="center"/>
           </w:tcPr>
           <w:p>
-            <w:r>
-              <w:t>{{ pt4_obs }}</w:t>
-            </w:r>
+            <w:pPr>
+              <w:rPr>
+                <w:rFonts w:cstheme="minorHAnsi"/>
+              </w:rPr>
+            </w:pPr>
           </w:p>
         </w:tc>
       </w:tr>
@@ -1753,8 +2331,106 @@
             <w:hideMark/>
           </w:tcPr>
           <w:p>
-            <w:r>
-              <w:t>{{ pt5_oui }}</w:t>
+            <w:pPr>
+              <w:tabs>
+                <w:tab w:val="left" w:pos="3780"/>
+              </w:tabs>
+              <w:jc w:val="center"/>
+              <w:rPr>
+                <w:rFonts w:cstheme="minorHAnsi"/>
+              </w:rPr>
+            </w:pPr>
+            <w:r>
+              <w:rPr>
+                <w:noProof/>
+              </w:rPr>
+              <mc:AlternateContent>
+                <mc:Choice Requires="wps">
+                  <w:drawing>
+                    <wp:anchor distT="0" distB="0" distL="114300" distR="114300" simplePos="0" relativeHeight="251655168" behindDoc="0" locked="0" layoutInCell="1" allowOverlap="1">
+                      <wp:simplePos x="0" y="0"/>
+                      <wp:positionH relativeFrom="column">
+                        <wp:posOffset>97790</wp:posOffset>
+                      </wp:positionH>
+                      <wp:positionV relativeFrom="paragraph">
+                        <wp:posOffset>22860</wp:posOffset>
+                      </wp:positionV>
+                      <wp:extent cx="127635" cy="116840"/>
+                      <wp:effectExtent l="0" t="0" r="24765" b="16510"/>
+                      <wp:wrapNone/>
+                      <wp:docPr id="3" name="AutoShape 647"/>
+                      <wp:cNvGraphicFramePr>
+                        <a:graphicFrameLocks xmlns:a="http://schemas.openxmlformats.org/drawingml/2006/main"/>
+                      </wp:cNvGraphicFramePr>
+                      <a:graphic xmlns:a="http://schemas.openxmlformats.org/drawingml/2006/main">
+                        <a:graphicData uri="http://schemas.microsoft.com/office/word/2010/wordprocessingShape">
+                          <wps:wsp>
+                            <wps:cNvSpPr>
+                              <a:spLocks noChangeArrowheads="1"/>
+                            </wps:cNvSpPr>
+                            <wps:spPr bwMode="auto">
+                              <a:xfrm>
+                                <a:off x="0" y="0"/>
+                                <a:ext cx="127635" cy="116840"/>
+                              </a:xfrm>
+                              <a:prstGeom prst="roundRect">
+                                <a:avLst>
+                                  <a:gd name="adj" fmla="val 16667"/>
+                                </a:avLst>
+                              </a:prstGeom>
+                              <a:solidFill>
+                                <a:schemeClr val="lt1">
+                                  <a:lumMod val="100000"/>
+                                  <a:lumOff val="0"/>
+                                </a:schemeClr>
+                              </a:solidFill>
+                              <a:ln w="12700">
+                                <a:solidFill>
+                                  <a:schemeClr val="dk1">
+                                    <a:lumMod val="100000"/>
+                                    <a:lumOff val="0"/>
+                                  </a:schemeClr>
+                                </a:solidFill>
+                                <a:round/>
+                                <a:headEnd/>
+                                <a:tailEnd/>
+                              </a:ln>
+                              <a:effectLst/>
+                              <a:extLst>
+                                <a:ext uri="{AF507438-7753-43E0-B8FC-AC1667EBCBE1}">
+                                  <a14:hiddenEffects xmlns:a14="http://schemas.microsoft.com/office/drawing/2010/main">
+                                    <a:effectLst>
+                                      <a:outerShdw dist="35921" dir="2700000" algn="ctr" rotWithShape="0">
+                                        <a:srgbClr val="868686"/>
+                                      </a:outerShdw>
+                                    </a:effectLst>
+                                  </a14:hiddenEffects>
+                                </a:ext>
+                              </a:extLst>
+                            </wps:spPr>
+                            <wps:bodyPr rot="0" vert="horz" wrap="square" lIns="91440" tIns="45720" rIns="91440" bIns="45720" anchor="t" anchorCtr="0" upright="1">
+                              <a:noAutofit/>
+                            </wps:bodyPr>
+                          </wps:wsp>
+                        </a:graphicData>
+                      </a:graphic>
+                      <wp14:sizeRelH relativeFrom="page">
+                        <wp14:pctWidth>0</wp14:pctWidth>
+                      </wp14:sizeRelH>
+                      <wp14:sizeRelV relativeFrom="page">
+                        <wp14:pctHeight>0</wp14:pctHeight>
+                      </wp14:sizeRelV>
+                    </wp:anchor>
+                  </w:drawing>
+                </mc:Choice>
+                <mc:Fallback>
+                  <w:pict>
+                    <v:roundrect w14:anchorId="6AD4FF0D" id="AutoShape 647" o:spid="_x0000_s1026" style="position:absolute;margin-left:7.7pt;margin-top:1.8pt;width:10.05pt;height:9.2pt;z-index:251655168;visibility:visible;mso-wrap-style:square;mso-width-percent:0;mso-height-percent:0;mso-wrap-distance-left:9pt;mso-wrap-distance-top:0;mso-wrap-distance-right:9pt;mso-wrap-distance-bottom:0;mso-position-horizontal:absolute;mso-position-horizontal-relative:text;mso-position-vertical:absolute;mso-position-vertical-relative:text;mso-width-percent:0;mso-height-percent:0;mso-width-relative:page;mso-height-relative:page;v-text-anchor:top" arcsize="10923f" o:gfxdata="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" fillcolor="white [3201]" strokecolor="black [3200]" strokeweight="1pt">
+                      <v:shadow color="#868686"/>
+                    </v:roundrect>
+                  </w:pict>
+                </mc:Fallback>
+              </mc:AlternateContent>
             </w:r>
           </w:p>
         </w:tc>
@@ -1770,9 +2446,11 @@
             <w:vAlign w:val="center"/>
           </w:tcPr>
           <w:p>
-            <w:r>
-              <w:t>{{ pt5_obs }}</w:t>
-            </w:r>
+            <w:pPr>
+              <w:rPr>
+                <w:rFonts w:cstheme="minorHAnsi"/>
+              </w:rPr>
+            </w:pPr>
           </w:p>
         </w:tc>
       </w:tr>
@@ -1839,8 +2517,106 @@
             <w:hideMark/>
           </w:tcPr>
           <w:p>
-            <w:r>
-              <w:t>{{ pt6_oui }}</w:t>
+            <w:pPr>
+              <w:tabs>
+                <w:tab w:val="left" w:pos="3780"/>
+              </w:tabs>
+              <w:jc w:val="center"/>
+              <w:rPr>
+                <w:rFonts w:cstheme="minorHAnsi"/>
+              </w:rPr>
+            </w:pPr>
+            <w:r>
+              <w:rPr>
+                <w:noProof/>
+              </w:rPr>
+              <mc:AlternateContent>
+                <mc:Choice Requires="wps">
+                  <w:drawing>
+                    <wp:anchor distT="0" distB="0" distL="114300" distR="114300" simplePos="0" relativeHeight="251664384" behindDoc="0" locked="0" layoutInCell="1" allowOverlap="1" wp14:anchorId="48ED4D5D" wp14:editId="52BDCE16">
+                      <wp:simplePos x="0" y="0"/>
+                      <wp:positionH relativeFrom="column">
+                        <wp:posOffset>97790</wp:posOffset>
+                      </wp:positionH>
+                      <wp:positionV relativeFrom="paragraph">
+                        <wp:posOffset>22860</wp:posOffset>
+                      </wp:positionV>
+                      <wp:extent cx="127635" cy="116840"/>
+                      <wp:effectExtent l="0" t="0" r="24765" b="16510"/>
+                      <wp:wrapNone/>
+                      <wp:docPr id="36" name="AutoShape 647"/>
+                      <wp:cNvGraphicFramePr>
+                        <a:graphicFrameLocks xmlns:a="http://schemas.openxmlformats.org/drawingml/2006/main"/>
+                      </wp:cNvGraphicFramePr>
+                      <a:graphic xmlns:a="http://schemas.openxmlformats.org/drawingml/2006/main">
+                        <a:graphicData uri="http://schemas.microsoft.com/office/word/2010/wordprocessingShape">
+                          <wps:wsp>
+                            <wps:cNvSpPr>
+                              <a:spLocks noChangeArrowheads="1"/>
+                            </wps:cNvSpPr>
+                            <wps:spPr bwMode="auto">
+                              <a:xfrm>
+                                <a:off x="0" y="0"/>
+                                <a:ext cx="127635" cy="116840"/>
+                              </a:xfrm>
+                              <a:prstGeom prst="roundRect">
+                                <a:avLst>
+                                  <a:gd name="adj" fmla="val 16667"/>
+                                </a:avLst>
+                              </a:prstGeom>
+                              <a:solidFill>
+                                <a:schemeClr val="lt1">
+                                  <a:lumMod val="100000"/>
+                                  <a:lumOff val="0"/>
+                                </a:schemeClr>
+                              </a:solidFill>
+                              <a:ln w="12700">
+                                <a:solidFill>
+                                  <a:schemeClr val="dk1">
+                                    <a:lumMod val="100000"/>
+                                    <a:lumOff val="0"/>
+                                  </a:schemeClr>
+                                </a:solidFill>
+                                <a:round/>
+                                <a:headEnd/>
+                                <a:tailEnd/>
+                              </a:ln>
+                              <a:effectLst/>
+                              <a:extLst>
+                                <a:ext uri="{AF507438-7753-43E0-B8FC-AC1667EBCBE1}">
+                                  <a14:hiddenEffects xmlns:a14="http://schemas.microsoft.com/office/drawing/2010/main">
+                                    <a:effectLst>
+                                      <a:outerShdw dist="35921" dir="2700000" algn="ctr" rotWithShape="0">
+                                        <a:srgbClr val="868686"/>
+                                      </a:outerShdw>
+                                    </a:effectLst>
+                                  </a14:hiddenEffects>
+                                </a:ext>
+                              </a:extLst>
+                            </wps:spPr>
+                            <wps:bodyPr rot="0" vert="horz" wrap="square" lIns="91440" tIns="45720" rIns="91440" bIns="45720" anchor="t" anchorCtr="0" upright="1">
+                              <a:noAutofit/>
+                            </wps:bodyPr>
+                          </wps:wsp>
+                        </a:graphicData>
+                      </a:graphic>
+                      <wp14:sizeRelH relativeFrom="page">
+                        <wp14:pctWidth>0</wp14:pctWidth>
+                      </wp14:sizeRelH>
+                      <wp14:sizeRelV relativeFrom="page">
+                        <wp14:pctHeight>0</wp14:pctHeight>
+                      </wp14:sizeRelV>
+                    </wp:anchor>
+                  </w:drawing>
+                </mc:Choice>
+                <mc:Fallback>
+                  <w:pict>
+                    <v:roundrect w14:anchorId="773F484A" id="AutoShape 647" o:spid="_x0000_s1026" style="position:absolute;margin-left:7.7pt;margin-top:1.8pt;width:10.05pt;height:9.2pt;z-index:251664384;visibility:visible;mso-wrap-style:square;mso-width-percent:0;mso-height-percent:0;mso-wrap-distance-left:9pt;mso-wrap-distance-top:0;mso-wrap-distance-right:9pt;mso-wrap-distance-bottom:0;mso-position-horizontal:absolute;mso-position-horizontal-relative:text;mso-position-vertical:absolute;mso-position-vertical-relative:text;mso-width-percent:0;mso-height-percent:0;mso-width-relative:page;mso-height-relative:page;v-text-anchor:top" arcsize="10923f" o:gfxdata="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" fillcolor="white [3201]" strokecolor="black [3200]" strokeweight="1pt">
+                      <v:shadow color="#868686"/>
+                    </v:roundrect>
+                  </w:pict>
+                </mc:Fallback>
+              </mc:AlternateContent>
             </w:r>
           </w:p>
         </w:tc>
@@ -1856,9 +2632,11 @@
             <w:vAlign w:val="center"/>
           </w:tcPr>
           <w:p>
-            <w:r>
-              <w:t>{{ pt6_obs }}</w:t>
-            </w:r>
+            <w:pPr>
+              <w:rPr>
+                <w:rFonts w:cstheme="minorHAnsi"/>
+              </w:rPr>
+            </w:pPr>
           </w:p>
         </w:tc>
       </w:tr>
@@ -1931,8 +2709,106 @@
             <w:hideMark/>
           </w:tcPr>
           <w:p>
-            <w:r>
-              <w:t>{{ pt7_oui }}</w:t>
+            <w:pPr>
+              <w:tabs>
+                <w:tab w:val="left" w:pos="3780"/>
+              </w:tabs>
+              <w:jc w:val="center"/>
+              <w:rPr>
+                <w:rFonts w:cstheme="minorHAnsi"/>
+              </w:rPr>
+            </w:pPr>
+            <w:r>
+              <w:rPr>
+                <w:noProof/>
+              </w:rPr>
+              <mc:AlternateContent>
+                <mc:Choice Requires="wps">
+                  <w:drawing>
+                    <wp:anchor distT="0" distB="0" distL="114300" distR="114300" simplePos="0" relativeHeight="251657216" behindDoc="0" locked="0" layoutInCell="1" allowOverlap="1">
+                      <wp:simplePos x="0" y="0"/>
+                      <wp:positionH relativeFrom="column">
+                        <wp:posOffset>97790</wp:posOffset>
+                      </wp:positionH>
+                      <wp:positionV relativeFrom="paragraph">
+                        <wp:posOffset>22860</wp:posOffset>
+                      </wp:positionV>
+                      <wp:extent cx="127635" cy="116840"/>
+                      <wp:effectExtent l="0" t="0" r="24765" b="16510"/>
+                      <wp:wrapNone/>
+                      <wp:docPr id="35" name="AutoShape 700"/>
+                      <wp:cNvGraphicFramePr>
+                        <a:graphicFrameLocks xmlns:a="http://schemas.openxmlformats.org/drawingml/2006/main"/>
+                      </wp:cNvGraphicFramePr>
+                      <a:graphic xmlns:a="http://schemas.openxmlformats.org/drawingml/2006/main">
+                        <a:graphicData uri="http://schemas.microsoft.com/office/word/2010/wordprocessingShape">
+                          <wps:wsp>
+                            <wps:cNvSpPr>
+                              <a:spLocks noChangeArrowheads="1"/>
+                            </wps:cNvSpPr>
+                            <wps:spPr bwMode="auto">
+                              <a:xfrm>
+                                <a:off x="0" y="0"/>
+                                <a:ext cx="127635" cy="116840"/>
+                              </a:xfrm>
+                              <a:prstGeom prst="roundRect">
+                                <a:avLst>
+                                  <a:gd name="adj" fmla="val 16667"/>
+                                </a:avLst>
+                              </a:prstGeom>
+                              <a:solidFill>
+                                <a:schemeClr val="lt1">
+                                  <a:lumMod val="100000"/>
+                                  <a:lumOff val="0"/>
+                                </a:schemeClr>
+                              </a:solidFill>
+                              <a:ln w="12700">
+                                <a:solidFill>
+                                  <a:schemeClr val="dk1">
+                                    <a:lumMod val="100000"/>
+                                    <a:lumOff val="0"/>
+                                  </a:schemeClr>
+                                </a:solidFill>
+                                <a:round/>
+                                <a:headEnd/>
+                                <a:tailEnd/>
+                              </a:ln>
+                              <a:effectLst/>
+                              <a:extLst>
+                                <a:ext uri="{AF507438-7753-43E0-B8FC-AC1667EBCBE1}">
+                                  <a14:hiddenEffects xmlns:a14="http://schemas.microsoft.com/office/drawing/2010/main">
+                                    <a:effectLst>
+                                      <a:outerShdw dist="35921" dir="2700000" algn="ctr" rotWithShape="0">
+                                        <a:srgbClr val="868686"/>
+                                      </a:outerShdw>
+                                    </a:effectLst>
+                                  </a14:hiddenEffects>
+                                </a:ext>
+                              </a:extLst>
+                            </wps:spPr>
+                            <wps:bodyPr rot="0" vert="horz" wrap="square" lIns="91440" tIns="45720" rIns="91440" bIns="45720" anchor="t" anchorCtr="0" upright="1">
+                              <a:noAutofit/>
+                            </wps:bodyPr>
+                          </wps:wsp>
+                        </a:graphicData>
+                      </a:graphic>
+                      <wp14:sizeRelH relativeFrom="page">
+                        <wp14:pctWidth>0</wp14:pctWidth>
+                      </wp14:sizeRelH>
+                      <wp14:sizeRelV relativeFrom="page">
+                        <wp14:pctHeight>0</wp14:pctHeight>
+                      </wp14:sizeRelV>
+                    </wp:anchor>
+                  </w:drawing>
+                </mc:Choice>
+                <mc:Fallback>
+                  <w:pict>
+                    <v:roundrect w14:anchorId="3E0AC0E5" id="AutoShape 700" o:spid="_x0000_s1026" style="position:absolute;margin-left:7.7pt;margin-top:1.8pt;width:10.05pt;height:9.2pt;z-index:251657216;visibility:visible;mso-wrap-style:square;mso-width-percent:0;mso-height-percent:0;mso-wrap-distance-left:9pt;mso-wrap-distance-top:0;mso-wrap-distance-right:9pt;mso-wrap-distance-bottom:0;mso-position-horizontal:absolute;mso-position-horizontal-relative:text;mso-position-vertical:absolute;mso-position-vertical-relative:text;mso-width-percent:0;mso-height-percent:0;mso-width-relative:page;mso-height-relative:page;v-text-anchor:top" arcsize="10923f" o:gfxdata="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" fillcolor="white [3201]" strokecolor="black [3200]" strokeweight="1pt">
+                      <v:shadow color="#868686"/>
+                    </v:roundrect>
+                  </w:pict>
+                </mc:Fallback>
+              </mc:AlternateContent>
             </w:r>
           </w:p>
         </w:tc>
@@ -1948,9 +2824,11 @@
             <w:vAlign w:val="center"/>
           </w:tcPr>
           <w:p>
-            <w:r>
-              <w:t>{{ pt7_obs }}</w:t>
-            </w:r>
+            <w:pPr>
+              <w:rPr>
+                <w:rFonts w:cstheme="minorHAnsi"/>
+              </w:rPr>
+            </w:pPr>
           </w:p>
         </w:tc>
       </w:tr>
@@ -2059,8 +2937,106 @@
             <w:hideMark/>
           </w:tcPr>
           <w:p>
-            <w:r>
-              <w:t>{{ pt8_oui }}</w:t>
+            <w:pPr>
+              <w:tabs>
+                <w:tab w:val="left" w:pos="3780"/>
+              </w:tabs>
+              <w:jc w:val="center"/>
+              <w:rPr>
+                <w:rFonts w:cstheme="minorHAnsi"/>
+              </w:rPr>
+            </w:pPr>
+            <w:r>
+              <w:rPr>
+                <w:noProof/>
+              </w:rPr>
+              <mc:AlternateContent>
+                <mc:Choice Requires="wps">
+                  <w:drawing>
+                    <wp:anchor distT="0" distB="0" distL="114300" distR="114300" simplePos="0" relativeHeight="251656192" behindDoc="0" locked="0" layoutInCell="1" allowOverlap="1">
+                      <wp:simplePos x="0" y="0"/>
+                      <wp:positionH relativeFrom="column">
+                        <wp:posOffset>97790</wp:posOffset>
+                      </wp:positionH>
+                      <wp:positionV relativeFrom="paragraph">
+                        <wp:posOffset>22860</wp:posOffset>
+                      </wp:positionV>
+                      <wp:extent cx="127635" cy="116840"/>
+                      <wp:effectExtent l="0" t="0" r="24765" b="16510"/>
+                      <wp:wrapNone/>
+                      <wp:docPr id="34" name="AutoShape 649"/>
+                      <wp:cNvGraphicFramePr>
+                        <a:graphicFrameLocks xmlns:a="http://schemas.openxmlformats.org/drawingml/2006/main"/>
+                      </wp:cNvGraphicFramePr>
+                      <a:graphic xmlns:a="http://schemas.openxmlformats.org/drawingml/2006/main">
+                        <a:graphicData uri="http://schemas.microsoft.com/office/word/2010/wordprocessingShape">
+                          <wps:wsp>
+                            <wps:cNvSpPr>
+                              <a:spLocks noChangeArrowheads="1"/>
+                            </wps:cNvSpPr>
+                            <wps:spPr bwMode="auto">
+                              <a:xfrm>
+                                <a:off x="0" y="0"/>
+                                <a:ext cx="127635" cy="116840"/>
+                              </a:xfrm>
+                              <a:prstGeom prst="roundRect">
+                                <a:avLst>
+                                  <a:gd name="adj" fmla="val 16667"/>
+                                </a:avLst>
+                              </a:prstGeom>
+                              <a:solidFill>
+                                <a:schemeClr val="lt1">
+                                  <a:lumMod val="100000"/>
+                                  <a:lumOff val="0"/>
+                                </a:schemeClr>
+                              </a:solidFill>
+                              <a:ln w="12700">
+                                <a:solidFill>
+                                  <a:schemeClr val="dk1">
+                                    <a:lumMod val="100000"/>
+                                    <a:lumOff val="0"/>
+                                  </a:schemeClr>
+                                </a:solidFill>
+                                <a:round/>
+                                <a:headEnd/>
+                                <a:tailEnd/>
+                              </a:ln>
+                              <a:effectLst/>
+                              <a:extLst>
+                                <a:ext uri="{AF507438-7753-43E0-B8FC-AC1667EBCBE1}">
+                                  <a14:hiddenEffects xmlns:a14="http://schemas.microsoft.com/office/drawing/2010/main">
+                                    <a:effectLst>
+                                      <a:outerShdw dist="35921" dir="2700000" algn="ctr" rotWithShape="0">
+                                        <a:srgbClr val="868686"/>
+                                      </a:outerShdw>
+                                    </a:effectLst>
+                                  </a14:hiddenEffects>
+                                </a:ext>
+                              </a:extLst>
+                            </wps:spPr>
+                            <wps:bodyPr rot="0" vert="horz" wrap="square" lIns="91440" tIns="45720" rIns="91440" bIns="45720" anchor="t" anchorCtr="0" upright="1">
+                              <a:noAutofit/>
+                            </wps:bodyPr>
+                          </wps:wsp>
+                        </a:graphicData>
+                      </a:graphic>
+                      <wp14:sizeRelH relativeFrom="page">
+                        <wp14:pctWidth>0</wp14:pctWidth>
+                      </wp14:sizeRelH>
+                      <wp14:sizeRelV relativeFrom="page">
+                        <wp14:pctHeight>0</wp14:pctHeight>
+                      </wp14:sizeRelV>
+                    </wp:anchor>
+                  </w:drawing>
+                </mc:Choice>
+                <mc:Fallback>
+                  <w:pict>
+                    <v:roundrect w14:anchorId="23A9E1E0" id="AutoShape 649" o:spid="_x0000_s1026" style="position:absolute;margin-left:7.7pt;margin-top:1.8pt;width:10.05pt;height:9.2pt;z-index:251656192;visibility:visible;mso-wrap-style:square;mso-width-percent:0;mso-height-percent:0;mso-wrap-distance-left:9pt;mso-wrap-distance-top:0;mso-wrap-distance-right:9pt;mso-wrap-distance-bottom:0;mso-position-horizontal:absolute;mso-position-horizontal-relative:text;mso-position-vertical:absolute;mso-position-vertical-relative:text;mso-width-percent:0;mso-height-percent:0;mso-width-relative:page;mso-height-relative:page;v-text-anchor:top" arcsize="10923f" o:gfxdata="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" fillcolor="white [3201]" strokecolor="black [3200]" strokeweight="1pt">
+                      <v:shadow color="#868686"/>
+                    </v:roundrect>
+                  </w:pict>
+                </mc:Fallback>
+              </mc:AlternateContent>
             </w:r>
           </w:p>
         </w:tc>
@@ -2076,9 +3052,11 @@
             <w:vAlign w:val="center"/>
           </w:tcPr>
           <w:p>
-            <w:r>
-              <w:t>{{ pt8_obs }}</w:t>
-            </w:r>
+            <w:pPr>
+              <w:rPr>
+                <w:rFonts w:cstheme="minorHAnsi"/>
+              </w:rPr>
+            </w:pPr>
           </w:p>
         </w:tc>
       </w:tr>
@@ -2136,8 +3114,106 @@
             <w:hideMark/>
           </w:tcPr>
           <w:p>
-            <w:r>
-              <w:t>{{ pt9_oui }}</w:t>
+            <w:pPr>
+              <w:tabs>
+                <w:tab w:val="left" w:pos="3780"/>
+              </w:tabs>
+              <w:jc w:val="center"/>
+              <w:rPr>
+                <w:rFonts w:cstheme="minorHAnsi"/>
+              </w:rPr>
+            </w:pPr>
+            <w:r>
+              <w:rPr>
+                <w:noProof/>
+              </w:rPr>
+              <mc:AlternateContent>
+                <mc:Choice Requires="wps">
+                  <w:drawing>
+                    <wp:anchor distT="0" distB="0" distL="114300" distR="114300" simplePos="0" relativeHeight="251662336" behindDoc="0" locked="0" layoutInCell="1" allowOverlap="1">
+                      <wp:simplePos x="0" y="0"/>
+                      <wp:positionH relativeFrom="column">
+                        <wp:posOffset>97790</wp:posOffset>
+                      </wp:positionH>
+                      <wp:positionV relativeFrom="paragraph">
+                        <wp:posOffset>22860</wp:posOffset>
+                      </wp:positionV>
+                      <wp:extent cx="127635" cy="116840"/>
+                      <wp:effectExtent l="0" t="0" r="24765" b="16510"/>
+                      <wp:wrapNone/>
+                      <wp:docPr id="42" name="AutoShape 698"/>
+                      <wp:cNvGraphicFramePr>
+                        <a:graphicFrameLocks xmlns:a="http://schemas.openxmlformats.org/drawingml/2006/main"/>
+                      </wp:cNvGraphicFramePr>
+                      <a:graphic xmlns:a="http://schemas.openxmlformats.org/drawingml/2006/main">
+                        <a:graphicData uri="http://schemas.microsoft.com/office/word/2010/wordprocessingShape">
+                          <wps:wsp>
+                            <wps:cNvSpPr>
+                              <a:spLocks noChangeArrowheads="1"/>
+                            </wps:cNvSpPr>
+                            <wps:spPr bwMode="auto">
+                              <a:xfrm>
+                                <a:off x="0" y="0"/>
+                                <a:ext cx="127635" cy="116840"/>
+                              </a:xfrm>
+                              <a:prstGeom prst="roundRect">
+                                <a:avLst>
+                                  <a:gd name="adj" fmla="val 16667"/>
+                                </a:avLst>
+                              </a:prstGeom>
+                              <a:solidFill>
+                                <a:schemeClr val="lt1">
+                                  <a:lumMod val="100000"/>
+                                  <a:lumOff val="0"/>
+                                </a:schemeClr>
+                              </a:solidFill>
+                              <a:ln w="12700">
+                                <a:solidFill>
+                                  <a:schemeClr val="dk1">
+                                    <a:lumMod val="100000"/>
+                                    <a:lumOff val="0"/>
+                                  </a:schemeClr>
+                                </a:solidFill>
+                                <a:round/>
+                                <a:headEnd/>
+                                <a:tailEnd/>
+                              </a:ln>
+                              <a:effectLst/>
+                              <a:extLst>
+                                <a:ext uri="{AF507438-7753-43E0-B8FC-AC1667EBCBE1}">
+                                  <a14:hiddenEffects xmlns:a14="http://schemas.microsoft.com/office/drawing/2010/main">
+                                    <a:effectLst>
+                                      <a:outerShdw dist="35921" dir="2700000" algn="ctr" rotWithShape="0">
+                                        <a:srgbClr val="868686"/>
+                                      </a:outerShdw>
+                                    </a:effectLst>
+                                  </a14:hiddenEffects>
+                                </a:ext>
+                              </a:extLst>
+                            </wps:spPr>
+                            <wps:bodyPr rot="0" vert="horz" wrap="square" lIns="91440" tIns="45720" rIns="91440" bIns="45720" anchor="t" anchorCtr="0" upright="1">
+                              <a:noAutofit/>
+                            </wps:bodyPr>
+                          </wps:wsp>
+                        </a:graphicData>
+                      </a:graphic>
+                      <wp14:sizeRelH relativeFrom="page">
+                        <wp14:pctWidth>0</wp14:pctWidth>
+                      </wp14:sizeRelH>
+                      <wp14:sizeRelV relativeFrom="page">
+                        <wp14:pctHeight>0</wp14:pctHeight>
+                      </wp14:sizeRelV>
+                    </wp:anchor>
+                  </w:drawing>
+                </mc:Choice>
+                <mc:Fallback>
+                  <w:pict>
+                    <v:roundrect w14:anchorId="4C25D56D" id="AutoShape 698" o:spid="_x0000_s1026" style="position:absolute;margin-left:7.7pt;margin-top:1.8pt;width:10.05pt;height:9.2pt;z-index:251662336;visibility:visible;mso-wrap-style:square;mso-width-percent:0;mso-height-percent:0;mso-wrap-distance-left:9pt;mso-wrap-distance-top:0;mso-wrap-distance-right:9pt;mso-wrap-distance-bottom:0;mso-position-horizontal:absolute;mso-position-horizontal-relative:text;mso-position-vertical:absolute;mso-position-vertical-relative:text;mso-width-percent:0;mso-height-percent:0;mso-width-relative:page;mso-height-relative:page;v-text-anchor:top" arcsize="10923f" o:gfxdata="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" fillcolor="white [3201]" strokecolor="black [3200]" strokeweight="1pt">
+                      <v:shadow color="#868686"/>
+                    </v:roundrect>
+                  </w:pict>
+                </mc:Fallback>
+              </mc:AlternateContent>
             </w:r>
           </w:p>
         </w:tc>
@@ -2153,9 +3229,11 @@
             <w:vAlign w:val="center"/>
           </w:tcPr>
           <w:p>
-            <w:r>
-              <w:t>{{ pt9_obs }}</w:t>
-            </w:r>
+            <w:pPr>
+              <w:rPr>
+                <w:rFonts w:cstheme="minorHAnsi"/>
+              </w:rPr>
+            </w:pPr>
           </w:p>
         </w:tc>
       </w:tr>
@@ -2227,8 +3305,106 @@
             <w:hideMark/>
           </w:tcPr>
           <w:p>
-            <w:r>
-              <w:t>{{ pt10_oui }}</w:t>
+            <w:pPr>
+              <w:tabs>
+                <w:tab w:val="left" w:pos="3780"/>
+              </w:tabs>
+              <w:jc w:val="center"/>
+              <w:rPr>
+                <w:rFonts w:cstheme="minorHAnsi"/>
+              </w:rPr>
+            </w:pPr>
+            <w:r>
+              <w:rPr>
+                <w:noProof/>
+              </w:rPr>
+              <mc:AlternateContent>
+                <mc:Choice Requires="wps">
+                  <w:drawing>
+                    <wp:anchor distT="0" distB="0" distL="114300" distR="114300" simplePos="0" relativeHeight="251659264" behindDoc="0" locked="0" layoutInCell="1" allowOverlap="1">
+                      <wp:simplePos x="0" y="0"/>
+                      <wp:positionH relativeFrom="column">
+                        <wp:posOffset>97790</wp:posOffset>
+                      </wp:positionH>
+                      <wp:positionV relativeFrom="paragraph">
+                        <wp:posOffset>22860</wp:posOffset>
+                      </wp:positionV>
+                      <wp:extent cx="127635" cy="116840"/>
+                      <wp:effectExtent l="0" t="0" r="24765" b="16510"/>
+                      <wp:wrapNone/>
+                      <wp:docPr id="33" name="AutoShape 650"/>
+                      <wp:cNvGraphicFramePr>
+                        <a:graphicFrameLocks xmlns:a="http://schemas.openxmlformats.org/drawingml/2006/main"/>
+                      </wp:cNvGraphicFramePr>
+                      <a:graphic xmlns:a="http://schemas.openxmlformats.org/drawingml/2006/main">
+                        <a:graphicData uri="http://schemas.microsoft.com/office/word/2010/wordprocessingShape">
+                          <wps:wsp>
+                            <wps:cNvSpPr>
+                              <a:spLocks noChangeArrowheads="1"/>
+                            </wps:cNvSpPr>
+                            <wps:spPr bwMode="auto">
+                              <a:xfrm>
+                                <a:off x="0" y="0"/>
+                                <a:ext cx="127635" cy="116840"/>
+                              </a:xfrm>
+                              <a:prstGeom prst="roundRect">
+                                <a:avLst>
+                                  <a:gd name="adj" fmla="val 16667"/>
+                                </a:avLst>
+                              </a:prstGeom>
+                              <a:solidFill>
+                                <a:schemeClr val="lt1">
+                                  <a:lumMod val="100000"/>
+                                  <a:lumOff val="0"/>
+                                </a:schemeClr>
+                              </a:solidFill>
+                              <a:ln w="12700">
+                                <a:solidFill>
+                                  <a:schemeClr val="dk1">
+                                    <a:lumMod val="100000"/>
+                                    <a:lumOff val="0"/>
+                                  </a:schemeClr>
+                                </a:solidFill>
+                                <a:round/>
+                                <a:headEnd/>
+                                <a:tailEnd/>
+                              </a:ln>
+                              <a:effectLst/>
+                              <a:extLst>
+                                <a:ext uri="{AF507438-7753-43E0-B8FC-AC1667EBCBE1}">
+                                  <a14:hiddenEffects xmlns:a14="http://schemas.microsoft.com/office/drawing/2010/main">
+                                    <a:effectLst>
+                                      <a:outerShdw dist="35921" dir="2700000" algn="ctr" rotWithShape="0">
+                                        <a:srgbClr val="868686"/>
+                                      </a:outerShdw>
+                                    </a:effectLst>
+                                  </a14:hiddenEffects>
+                                </a:ext>
+                              </a:extLst>
+                            </wps:spPr>
+                            <wps:bodyPr rot="0" vert="horz" wrap="square" lIns="91440" tIns="45720" rIns="91440" bIns="45720" anchor="t" anchorCtr="0" upright="1">
+                              <a:noAutofit/>
+                            </wps:bodyPr>
+                          </wps:wsp>
+                        </a:graphicData>
+                      </a:graphic>
+                      <wp14:sizeRelH relativeFrom="page">
+                        <wp14:pctWidth>0</wp14:pctWidth>
+                      </wp14:sizeRelH>
+                      <wp14:sizeRelV relativeFrom="page">
+                        <wp14:pctHeight>0</wp14:pctHeight>
+                      </wp14:sizeRelV>
+                    </wp:anchor>
+                  </w:drawing>
+                </mc:Choice>
+                <mc:Fallback>
+                  <w:pict>
+                    <v:roundrect w14:anchorId="4C4320C7" id="AutoShape 650" o:spid="_x0000_s1026" style="position:absolute;margin-left:7.7pt;margin-top:1.8pt;width:10.05pt;height:9.2pt;z-index:251659264;visibility:visible;mso-wrap-style:square;mso-width-percent:0;mso-height-percent:0;mso-wrap-distance-left:9pt;mso-wrap-distance-top:0;mso-wrap-distance-right:9pt;mso-wrap-distance-bottom:0;mso-position-horizontal:absolute;mso-position-horizontal-relative:text;mso-position-vertical:absolute;mso-position-vertical-relative:text;mso-width-percent:0;mso-height-percent:0;mso-width-relative:page;mso-height-relative:page;v-text-anchor:top" arcsize="10923f" o:gfxdata="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" fillcolor="white [3201]" strokecolor="black [3200]" strokeweight="1pt">
+                      <v:shadow color="#868686"/>
+                    </v:roundrect>
+                  </w:pict>
+                </mc:Fallback>
+              </mc:AlternateContent>
             </w:r>
           </w:p>
         </w:tc>
@@ -2244,9 +3420,11 @@
             <w:vAlign w:val="center"/>
           </w:tcPr>
           <w:p>
-            <w:r>
-              <w:t>{{ pt10_obs }}</w:t>
-            </w:r>
+            <w:pPr>
+              <w:rPr>
+                <w:rFonts w:cstheme="minorHAnsi"/>
+              </w:rPr>
+            </w:pPr>
           </w:p>
         </w:tc>
       </w:tr>
@@ -2268,7 +3446,7 @@
       <w:headerReference w:type="even" r:id="rId8"/>
       <w:headerReference w:type="default" r:id="rId9"/>
       <w:footerReference w:type="default" r:id="rId10"/>
-      <w:pgSz w:w="11906" w:h="16838"/>
+      <w:pgSz w:w="11906" w:h="16838" w:orient="portrait"/>
       <w:pgMar w:top="720" w:right="720" w:bottom="720" w:left="720" w:header="284" w:footer="624" w:gutter="567"/>
       <w:cols w:space="708"/>
       <w:docGrid w:linePitch="360"/>

</xml_diff>